<commit_message>
DATA-04: rebrand synthetic sources and prepare Valentino product data
</commit_message>
<xml_diff>
--- a/generated/sources/internal_comms/hq_memos/2026-09-30_価格改定のお知らせ_11月1日_継続品番.docx
+++ b/generated/sources/internal_comms/hq_memos/2026-09-30_価格改定のお知らせ_11月1日_継続品番.docx
@@ -33,7 +33,7 @@
     </w:p>
     <w:p>
       <w:r>
-        <w:t>標記の件、本社（ミラノ）との協議の結果、継続品番（キャリーオーバー）につきまして2026年11月1日（日）より販売価格を改定いたします。為替および原材料費の上昇によるもので、平均改定率は約8％となります。FW26新作（ILVARO、AMBRINE、ARNEB、ROSIERE等）およびGenius POLARISは対象外です。</w:t>
+        <w:t>標記の件、本社（ミラノ）との協議の結果、継続品番（キャリーオーバー）につきまして2026年11月1日（日）より販売価格を改定いたします。為替および原材料費の上昇によるもので、平均改定率は約8％となります。FW26新作（IRIDIA、AMALIA、ARTEM、RIVIERA等）およびCouture ASTRAは対象外です。</w:t>
       </w:r>
     </w:p>
     <w:p>
@@ -167,7 +167,7 @@
           </w:tcPr>
           <w:p>
             <w:r>
-              <w:t>MAYA</w:t>
+              <w:t>NOVA</w:t>
             </w:r>
           </w:p>
         </w:tc>
@@ -219,7 +219,7 @@
           </w:tcPr>
           <w:p>
             <w:r>
-              <w:t>MAIRE</w:t>
+              <w:t>AUREA</w:t>
             </w:r>
           </w:p>
         </w:tc>
@@ -271,7 +271,7 @@
           </w:tcPr>
           <w:p>
             <w:r>
-              <w:t>HERMINE</w:t>
+              <w:t>LIVIANA</w:t>
             </w:r>
           </w:p>
         </w:tc>
@@ -323,7 +323,7 @@
           </w:tcPr>
           <w:p>
             <w:r>
-              <w:t>MONTCLA</w:t>
+              <w:t>MISTRAL</w:t>
             </w:r>
           </w:p>
         </w:tc>
@@ -375,7 +375,7 @@
           </w:tcPr>
           <w:p>
             <w:r>
-              <w:t>BADY</w:t>
+              <w:t>ARIA</w:t>
             </w:r>
           </w:p>
         </w:tc>
@@ -427,7 +427,7 @@
           </w:tcPr>
           <w:p>
             <w:r>
-              <w:t>TIB</w:t>
+              <w:t>VEL</w:t>
             </w:r>
           </w:p>
         </w:tc>
@@ -479,7 +479,7 @@
           </w:tcPr>
           <w:p>
             <w:r>
-              <w:t>LOGO CARDIGAN</w:t>
+              <w:t>VLOGO CARDIGAN</w:t>
             </w:r>
           </w:p>
         </w:tc>
@@ -531,7 +531,7 @@
           </w:tcPr>
           <w:p>
             <w:r>
-              <w:t>LOGO HOODIE</w:t>
+              <w:t>VLOGO HOODIE</w:t>
             </w:r>
           </w:p>
         </w:tc>
@@ -600,7 +600,7 @@
       <w:pStyle w:val="Footer"/>
     </w:pPr>
     <w:r>
-      <w:t>社外秘／Moncler Japan リテール本部　MD-JP-2026-031</w:t>
+      <w:t>社外秘／Valentino Japan リテール本部　MD-JP-2026-031</w:t>
     </w:r>
   </w:p>
 </w:ftr>

</xml_diff>

<commit_message>
DATA-04: Valentino rebrand and visual product data (#158)
* DATA-04: start

* DATA-04: rebrand synthetic sources and prepare Valentino product data

* DATA-04: refresh rebranded replay inputs and insight hashes
</commit_message>
<xml_diff>
--- a/generated/sources/internal_comms/hq_memos/2026-09-30_価格改定のお知らせ_11月1日_継続品番.docx
+++ b/generated/sources/internal_comms/hq_memos/2026-09-30_価格改定のお知らせ_11月1日_継続品番.docx
@@ -33,7 +33,7 @@
     </w:p>
     <w:p>
       <w:r>
-        <w:t>標記の件、本社（ミラノ）との協議の結果、継続品番（キャリーオーバー）につきまして2026年11月1日（日）より販売価格を改定いたします。為替および原材料費の上昇によるもので、平均改定率は約8％となります。FW26新作（ILVARO、AMBRINE、ARNEB、ROSIERE等）およびGenius POLARISは対象外です。</w:t>
+        <w:t>標記の件、本社（ミラノ）との協議の結果、継続品番（キャリーオーバー）につきまして2026年11月1日（日）より販売価格を改定いたします。為替および原材料費の上昇によるもので、平均改定率は約8％となります。FW26新作（IRIDIA、AMALIA、ARTEM、RIVIERA等）およびCouture ASTRAは対象外です。</w:t>
       </w:r>
     </w:p>
     <w:p>
@@ -167,7 +167,7 @@
           </w:tcPr>
           <w:p>
             <w:r>
-              <w:t>MAYA</w:t>
+              <w:t>NOVA</w:t>
             </w:r>
           </w:p>
         </w:tc>
@@ -219,7 +219,7 @@
           </w:tcPr>
           <w:p>
             <w:r>
-              <w:t>MAIRE</w:t>
+              <w:t>AUREA</w:t>
             </w:r>
           </w:p>
         </w:tc>
@@ -271,7 +271,7 @@
           </w:tcPr>
           <w:p>
             <w:r>
-              <w:t>HERMINE</w:t>
+              <w:t>LIVIANA</w:t>
             </w:r>
           </w:p>
         </w:tc>
@@ -323,7 +323,7 @@
           </w:tcPr>
           <w:p>
             <w:r>
-              <w:t>MONTCLA</w:t>
+              <w:t>MISTRAL</w:t>
             </w:r>
           </w:p>
         </w:tc>
@@ -375,7 +375,7 @@
           </w:tcPr>
           <w:p>
             <w:r>
-              <w:t>BADY</w:t>
+              <w:t>ARIA</w:t>
             </w:r>
           </w:p>
         </w:tc>
@@ -427,7 +427,7 @@
           </w:tcPr>
           <w:p>
             <w:r>
-              <w:t>TIB</w:t>
+              <w:t>VEL</w:t>
             </w:r>
           </w:p>
         </w:tc>
@@ -479,7 +479,7 @@
           </w:tcPr>
           <w:p>
             <w:r>
-              <w:t>LOGO CARDIGAN</w:t>
+              <w:t>VLOGO CARDIGAN</w:t>
             </w:r>
           </w:p>
         </w:tc>
@@ -531,7 +531,7 @@
           </w:tcPr>
           <w:p>
             <w:r>
-              <w:t>LOGO HOODIE</w:t>
+              <w:t>VLOGO HOODIE</w:t>
             </w:r>
           </w:p>
         </w:tc>
@@ -600,7 +600,7 @@
       <w:pStyle w:val="Footer"/>
     </w:pPr>
     <w:r>
-      <w:t>社外秘／Moncler Japan リテール本部　MD-JP-2026-031</w:t>
+      <w:t>社外秘／Valentino Japan リテール本部　MD-JP-2026-031</w:t>
     </w:r>
   </w:p>
 </w:ftr>

</xml_diff>